<commit_message>
added API test plan
</commit_message>
<xml_diff>
--- a/Planning/Business Requirements Document.docx
+++ b/Planning/Business Requirements Document.docx
@@ -500,7 +500,9 @@
           <w:szCs w:val="24"/>
         </w:rPr>
       </w:pPr>
-      <w:r>
+    </w:p>
+    <w:p>
+      <w:pPr>
         <w:rPr>
           <w:rFonts w:cstheme="minorHAnsi"/>
           <w:b/>
@@ -510,6 +512,18 @@
           <w:sz w:val="24"/>
           <w:szCs w:val="24"/>
         </w:rPr>
+      </w:pPr>
+      <w:r>
+        <w:rPr>
+          <w:rFonts w:cstheme="minorHAnsi"/>
+          <w:b/>
+          <w:bCs/>
+          <w:color w:val="44546A" w:themeColor="text2"/>
+          <w:w w:val="115"/>
+          <w:sz w:val="24"/>
+          <w:szCs w:val="24"/>
+        </w:rPr>
+        <w:lastRenderedPageBreak/>
         <w:t>Executive Summary</w:t>
       </w:r>
     </w:p>
@@ -531,7 +545,6 @@
           <w:sz w:val="18"/>
           <w:szCs w:val="18"/>
         </w:rPr>
-        <w:lastRenderedPageBreak/>
         <w:t xml:space="preserve">The Executive Summary provides a concise yet comprehensive overview of the project, allowing stakeholders to quickly grasp its purpose, objectives, and expected outcomes. It should clearly communicate </w:t>
       </w:r>
       <w:r>
@@ -1448,6 +1461,7 @@
           <w:sz w:val="18"/>
           <w:szCs w:val="18"/>
         </w:rPr>
+        <w:lastRenderedPageBreak/>
         <w:t>Guidelines for Writing Business Requirements</w:t>
       </w:r>
     </w:p>
@@ -1476,7 +1490,6 @@
           <w:sz w:val="18"/>
           <w:szCs w:val="18"/>
         </w:rPr>
-        <w:lastRenderedPageBreak/>
         <w:t>Measurable &amp; Testable:</w:t>
       </w:r>
       <w:r>

</xml_diff>